<commit_message>
Rebrand all course titles to ICDFA specialized names - remove vendor course names from titles, headings, weekly schedules, and descriptions
</commit_message>
<xml_diff>
--- a/ICDFA_Internship_Programme_Curriculum.docx
+++ b/ICDFA_Internship_Programme_Curriculum.docx
@@ -207,12 +207,12 @@
         </w:numPr>
         <w:pStyle w:val="Compact"/>
       </w:pPr>
-      <w:hyperlink w:anchor="cip-a101-introduction-to-linux-1">
+      <w:hyperlink w:anchor="cip-a101-linux-systems-fundamentals-i">
         <w:r>
           <w:rPr>
             <w:rStyle w:val="Hyperlink"/>
           </w:rPr>
-          <w:t xml:space="preserve">CIP-A101: Introduction to Linux 1</w:t>
+          <w:t xml:space="preserve">CIP-A101: Linux Systems Fundamentals I</w:t>
         </w:r>
       </w:hyperlink>
     </w:p>
@@ -224,12 +224,12 @@
         </w:numPr>
         <w:pStyle w:val="Compact"/>
       </w:pPr>
-      <w:hyperlink w:anchor="cip-a102-introduction-to-linux-2">
+      <w:hyperlink w:anchor="cip-a102-linux-systems-fundamentals-ii">
         <w:r>
           <w:rPr>
             <w:rStyle w:val="Hyperlink"/>
           </w:rPr>
-          <w:t xml:space="preserve">CIP-A102: Introduction to Linux 2</w:t>
+          <w:t xml:space="preserve">CIP-A102: Linux Systems Fundamentals II</w:t>
         </w:r>
       </w:hyperlink>
     </w:p>
@@ -241,12 +241,12 @@
         </w:numPr>
         <w:pStyle w:val="Compact"/>
       </w:pPr>
-      <w:hyperlink w:anchor="cip-a103-network-security-fundamentals">
+      <w:hyperlink w:anchor="X71b20abb8360846652325ad0c9b20aa619da2ca">
         <w:r>
           <w:rPr>
             <w:rStyle w:val="Hyperlink"/>
           </w:rPr>
-          <w:t xml:space="preserve">CIP-A103: Network Security Fundamentals</w:t>
+          <w:t xml:space="preserve">CIP-A103: Network Defence &amp; Traffic Analysis</w:t>
         </w:r>
       </w:hyperlink>
     </w:p>
@@ -258,12 +258,12 @@
         </w:numPr>
         <w:pStyle w:val="Compact"/>
       </w:pPr>
-      <w:hyperlink w:anchor="Xeef784f4d3e24d45f3cfe034522f5eae26cedf0">
+      <w:hyperlink w:anchor="cip-a104-offensive-security-operations-i">
         <w:r>
           <w:rPr>
             <w:rStyle w:val="Hyperlink"/>
           </w:rPr>
-          <w:t xml:space="preserve">CIP-A104: NDG Ethical Hacking v2 – Series 1</w:t>
+          <w:t xml:space="preserve">CIP-A104: Offensive Security Operations I</w:t>
         </w:r>
       </w:hyperlink>
     </w:p>
@@ -275,12 +275,12 @@
         </w:numPr>
         <w:pStyle w:val="Compact"/>
       </w:pPr>
-      <w:hyperlink w:anchor="X12b700c15c49942fae01e7d41e421cb5edef09a">
+      <w:hyperlink w:anchor="X38af9fbd62e09e4c247eec505131f317a783e5e">
         <w:r>
           <w:rPr>
             <w:rStyle w:val="Hyperlink"/>
           </w:rPr>
-          <w:t xml:space="preserve">CIP-A105: NDG Ethical Hacking v2 – Series 2</w:t>
+          <w:t xml:space="preserve">CIP-A105: Offensive Security Operations II</w:t>
         </w:r>
       </w:hyperlink>
     </w:p>
@@ -292,12 +292,12 @@
         </w:numPr>
         <w:pStyle w:val="Compact"/>
       </w:pPr>
-      <w:hyperlink w:anchor="Xbe6755dace1c4bc2b1a5d76fef0c10edcffd953">
+      <w:hyperlink w:anchor="Xa92421a4be4aad0b76468ebf481d6dbf060fb85">
         <w:r>
           <w:rPr>
             <w:rStyle w:val="Hyperlink"/>
           </w:rPr>
-          <w:t xml:space="preserve">CIP-A106: Intro to Critical Infrastructure</w:t>
+          <w:t xml:space="preserve">CIP-A106: Critical Infrastructure &amp; ICS Security</w:t>
         </w:r>
       </w:hyperlink>
     </w:p>
@@ -309,12 +309,12 @@
         </w:numPr>
         <w:pStyle w:val="Compact"/>
       </w:pPr>
-      <w:hyperlink w:anchor="X12e5c7e9676214965db8a85ef7117f9e2407b6f">
+      <w:hyperlink w:anchor="X14ee5b3f8d07bbf8814fc67aad8c9b834bfcb30">
         <w:r>
           <w:rPr>
             <w:rStyle w:val="Hyperlink"/>
           </w:rPr>
-          <w:t xml:space="preserve">CIP-A107: Security Operations Fundamentals</w:t>
+          <w:t xml:space="preserve">CIP-A107: Security Operations Centre (SOC) Essentials</w:t>
         </w:r>
       </w:hyperlink>
     </w:p>
@@ -326,12 +326,12 @@
         </w:numPr>
         <w:pStyle w:val="Compact"/>
       </w:pPr>
-      <w:hyperlink w:anchor="cip-a108-ndg-security-v4">
+      <w:hyperlink w:anchor="cip-a108-applied-security-engineering">
         <w:r>
           <w:rPr>
             <w:rStyle w:val="Hyperlink"/>
           </w:rPr>
-          <w:t xml:space="preserve">CIP-A108: NDG Security+ v4</w:t>
+          <w:t xml:space="preserve">CIP-A108: Applied Security Engineering</w:t>
         </w:r>
       </w:hyperlink>
     </w:p>
@@ -343,12 +343,12 @@
         </w:numPr>
         <w:pStyle w:val="Compact"/>
       </w:pPr>
-      <w:hyperlink w:anchor="cip-a109-cloud-security-fundamentals">
+      <w:hyperlink w:anchor="cip-a109-cloud-security-architecture">
         <w:r>
           <w:rPr>
             <w:rStyle w:val="Hyperlink"/>
           </w:rPr>
-          <w:t xml:space="preserve">CIP-A109: Cloud Security Fundamentals</w:t>
+          <w:t xml:space="preserve">CIP-A109: Cloud Security Architecture</w:t>
         </w:r>
       </w:hyperlink>
     </w:p>
@@ -360,12 +360,12 @@
         </w:numPr>
         <w:pStyle w:val="Compact"/>
       </w:pPr>
-      <w:hyperlink w:anchor="cip-a110-cloud-security-automation">
+      <w:hyperlink w:anchor="X5bb01efd0ed2c8eb5ba1457a9394cba4a5340a9">
         <w:r>
           <w:rPr>
             <w:rStyle w:val="Hyperlink"/>
           </w:rPr>
-          <w:t xml:space="preserve">CIP-A110: Cloud Security Automation</w:t>
+          <w:t xml:space="preserve">CIP-A110: Cloud Security Automation &amp; DevSecOps</w:t>
         </w:r>
       </w:hyperlink>
     </w:p>
@@ -394,12 +394,12 @@
         </w:numPr>
         <w:pStyle w:val="Compact"/>
       </w:pPr>
-      <w:hyperlink w:anchor="cip-b101-introduction-to-linux-1">
+      <w:hyperlink w:anchor="cip-b101-linux-systems-fundamentals-i">
         <w:r>
           <w:rPr>
             <w:rStyle w:val="Hyperlink"/>
           </w:rPr>
-          <w:t xml:space="preserve">CIP-B101: Introduction to Linux 1</w:t>
+          <w:t xml:space="preserve">CIP-B101: Linux Systems Fundamentals I</w:t>
         </w:r>
       </w:hyperlink>
     </w:p>
@@ -411,12 +411,12 @@
         </w:numPr>
         <w:pStyle w:val="Compact"/>
       </w:pPr>
-      <w:hyperlink w:anchor="cip-b102-introduction-to-linux-2">
+      <w:hyperlink w:anchor="cip-b102-linux-systems-fundamentals-ii">
         <w:r>
           <w:rPr>
             <w:rStyle w:val="Hyperlink"/>
           </w:rPr>
-          <w:t xml:space="preserve">CIP-B102: Introduction to Linux 2</w:t>
+          <w:t xml:space="preserve">CIP-B102: Linux Systems Fundamentals II</w:t>
         </w:r>
       </w:hyperlink>
     </w:p>
@@ -428,12 +428,12 @@
         </w:numPr>
         <w:pStyle w:val="Compact"/>
       </w:pPr>
-      <w:hyperlink w:anchor="cip-b103-network-security-fundamentals">
+      <w:hyperlink w:anchor="Xb344965e09ad46278fe894cbb2c2f2da15bd498">
         <w:r>
           <w:rPr>
             <w:rStyle w:val="Hyperlink"/>
           </w:rPr>
-          <w:t xml:space="preserve">CIP-B103: Network Security Fundamentals</w:t>
+          <w:t xml:space="preserve">CIP-B103: Network Defence &amp; Traffic Analysis</w:t>
         </w:r>
       </w:hyperlink>
     </w:p>
@@ -445,12 +445,12 @@
         </w:numPr>
         <w:pStyle w:val="Compact"/>
       </w:pPr>
-      <w:hyperlink w:anchor="cip-b104-ndg-security-v4">
+      <w:hyperlink w:anchor="cip-b104-applied-security-engineering">
         <w:r>
           <w:rPr>
             <w:rStyle w:val="Hyperlink"/>
           </w:rPr>
-          <w:t xml:space="preserve">CIP-B104: NDG Security+ v4</w:t>
+          <w:t xml:space="preserve">CIP-B104: Applied Security Engineering</w:t>
         </w:r>
       </w:hyperlink>
     </w:p>
@@ -462,12 +462,12 @@
         </w:numPr>
         <w:pStyle w:val="Compact"/>
       </w:pPr>
-      <w:hyperlink w:anchor="cip-b105-ndg-forensics-v2">
+      <w:hyperlink w:anchor="Xd5b32a7958edfe25822d8062646e4d010eb8b5e">
         <w:r>
           <w:rPr>
             <w:rStyle w:val="Hyperlink"/>
           </w:rPr>
-          <w:t xml:space="preserve">CIP-B105: NDG Forensics v2</w:t>
+          <w:t xml:space="preserve">CIP-B105: Digital Forensics &amp; Evidence Analysis</w:t>
         </w:r>
       </w:hyperlink>
     </w:p>
@@ -479,12 +479,12 @@
         </w:numPr>
         <w:pStyle w:val="Compact"/>
       </w:pPr>
-      <w:hyperlink w:anchor="X19f293a5a644577c8a2e3ce56838687f518d071">
+      <w:hyperlink w:anchor="X69a80a5e249c4e4279416c9079e2f2f01dc8d86">
         <w:r>
           <w:rPr>
             <w:rStyle w:val="Hyperlink"/>
           </w:rPr>
-          <w:t xml:space="preserve">CIP-B106: Security Operations Fundamentals</w:t>
+          <w:t xml:space="preserve">CIP-B106: Security Operations Centre (SOC) Essentials</w:t>
         </w:r>
       </w:hyperlink>
     </w:p>
@@ -496,12 +496,12 @@
         </w:numPr>
         <w:pStyle w:val="Compact"/>
       </w:pPr>
-      <w:hyperlink w:anchor="cip-b107-forensics-case-studies">
+      <w:hyperlink w:anchor="Xd721ca47522dfe15d5e687d86634a618d5041da">
         <w:r>
           <w:rPr>
             <w:rStyle w:val="Hyperlink"/>
           </w:rPr>
-          <w:t xml:space="preserve">CIP-B107: Forensics Case Studies</w:t>
+          <w:t xml:space="preserve">CIP-B107: Advanced Forensic Investigations</w:t>
         </w:r>
       </w:hyperlink>
     </w:p>
@@ -870,9 +870,9 @@
       <w:pPr>
         <w:pStyle w:val="Heading3"/>
       </w:pPr>
-      <w:bookmarkStart w:id="27" w:name="cip-a101-introduction-to-linux-1"/>
-      <w:r>
-        <w:t xml:space="preserve">CIP-A101: Introduction to Linux 1</w:t>
+      <w:bookmarkStart w:id="27" w:name="cip-a101-linux-systems-fundamentals-i"/>
+      <w:r>
+        <w:t xml:space="preserve">CIP-A101: Linux Systems Fundamentals I</w:t>
       </w:r>
       <w:bookmarkEnd w:id="27"/>
     </w:p>
@@ -905,7 +905,7 @@
         <w:t xml:space="preserve"> </w:t>
       </w:r>
       <w:r>
-        <w:t xml:space="preserve">Introduction to Linux 1</w:t>
+        <w:t xml:space="preserve">Linux Systems Fundamentals I</w:t>
       </w:r>
       <w:r>
         <w:t xml:space="preserve"> </w:t>
@@ -1813,9 +1813,9 @@
       <w:pPr>
         <w:pStyle w:val="Heading3"/>
       </w:pPr>
-      <w:bookmarkStart w:id="28" w:name="cip-a102-introduction-to-linux-2"/>
-      <w:r>
-        <w:t xml:space="preserve">CIP-A102: Introduction to Linux 2</w:t>
+      <w:bookmarkStart w:id="28" w:name="cip-a102-linux-systems-fundamentals-ii"/>
+      <w:r>
+        <w:t xml:space="preserve">CIP-A102: Linux Systems Fundamentals II</w:t>
       </w:r>
       <w:bookmarkEnd w:id="28"/>
     </w:p>
@@ -1848,7 +1848,7 @@
         <w:t xml:space="preserve"> </w:t>
       </w:r>
       <w:r>
-        <w:t xml:space="preserve">Introduction to Linux 2</w:t>
+        <w:t xml:space="preserve">Linux Systems Fundamentals II</w:t>
       </w:r>
       <w:r>
         <w:t xml:space="preserve"> </w:t>
@@ -2620,9 +2620,9 @@
       <w:pPr>
         <w:pStyle w:val="Heading3"/>
       </w:pPr>
-      <w:bookmarkStart w:id="29" w:name="cip-a103-network-security-fundamentals"/>
-      <w:r>
-        <w:t xml:space="preserve">CIP-A103: Network Security Fundamentals</w:t>
+      <w:bookmarkStart w:id="29" w:name="Xc39f3f92b1f4956629930a8a5a7fc5248b0b18d"/>
+      <w:r>
+        <w:t xml:space="preserve">CIP-A103: Network Defence &amp; Traffic Analysis</w:t>
       </w:r>
       <w:bookmarkEnd w:id="29"/>
     </w:p>
@@ -2655,7 +2655,7 @@
         <w:t xml:space="preserve"> </w:t>
       </w:r>
       <w:r>
-        <w:t xml:space="preserve">Network Security Fundamentals</w:t>
+        <w:t xml:space="preserve">Network Defence &amp; Traffic Analysis</w:t>
       </w:r>
       <w:r>
         <w:t xml:space="preserve"> </w:t>
@@ -2964,9 +2964,9 @@
       <w:pPr>
         <w:pStyle w:val="Heading3"/>
       </w:pPr>
-      <w:bookmarkStart w:id="30" w:name="cip-a104-ndg-ethical-hacking-v2-series-1"/>
-      <w:r>
-        <w:t xml:space="preserve">CIP-A104: NDG Ethical Hacking v2 – Series 1</w:t>
+      <w:bookmarkStart w:id="30" w:name="cip-a104-offensive-security-operations-i"/>
+      <w:r>
+        <w:t xml:space="preserve">CIP-A104: Offensive Security Operations I</w:t>
       </w:r>
       <w:bookmarkEnd w:id="30"/>
     </w:p>
@@ -2999,7 +2999,7 @@
         <w:t xml:space="preserve"> </w:t>
       </w:r>
       <w:r>
-        <w:t xml:space="preserve">NDG Ethical Hacking v2 – Series 1</w:t>
+        <w:t xml:space="preserve">Offensive Security Operations I</w:t>
       </w:r>
       <w:r>
         <w:t xml:space="preserve"> </w:t>
@@ -3044,7 +3044,7 @@
         <w:t xml:space="preserve"> </w:t>
       </w:r>
       <w:r>
-        <w:t xml:space="preserve">Prepare for a variety of IT positions, including Cyber Security Analyst, Penetration Tester, Ethical Hacker, Security Engineer, and Cyber Security Engineer. Series 1 covers reconnaissance, scanning, vulnerability assessment, exploitation, and social engineering.</w:t>
+        <w:t xml:space="preserve">Develop the core offensive security skills required for roles such as Cyber Security Analyst, Penetration Tester, Ethical Hacker, Security Engineer, and Cyber Security Engineer. This course covers reconnaissance, scanning, vulnerability assessment, exploitation, and social engineering.</w:t>
       </w:r>
     </w:p>
     <w:p>
@@ -3565,9 +3565,9 @@
       <w:pPr>
         <w:pStyle w:val="Heading3"/>
       </w:pPr>
-      <w:bookmarkStart w:id="31" w:name="cip-a105-ndg-ethical-hacking-v2-series-2"/>
-      <w:r>
-        <w:t xml:space="preserve">CIP-A105: NDG Ethical Hacking v2 – Series 2</w:t>
+      <w:bookmarkStart w:id="31" w:name="X38af9fbd62e09e4c247eec505131f317a783e5e"/>
+      <w:r>
+        <w:t xml:space="preserve">CIP-A105: Offensive Security Operations II</w:t>
       </w:r>
       <w:bookmarkEnd w:id="31"/>
     </w:p>
@@ -3600,7 +3600,7 @@
         <w:t xml:space="preserve"> </w:t>
       </w:r>
       <w:r>
-        <w:t xml:space="preserve">NDG Ethical Hacking v2 – Series 2</w:t>
+        <w:t xml:space="preserve">Offensive Security Operations II</w:t>
       </w:r>
       <w:r>
         <w:t xml:space="preserve"> </w:t>
@@ -3645,7 +3645,7 @@
         <w:t xml:space="preserve"> </w:t>
       </w:r>
       <w:r>
-        <w:t xml:space="preserve">Continuation of NDG Ethical Hacking v2. Series 2 covers advanced scanning methodology, enumeration, system hacking, web-based hacking, mobile hacking, and cryptography.</w:t>
+        <w:t xml:space="preserve">Continuation of Offensive Security Operations I. This course covers advanced scanning methodology, enumeration, system hacking, web-based hacking, mobile hacking, and cryptography.</w:t>
       </w:r>
     </w:p>
     <w:p>
@@ -3926,9 +3926,9 @@
       <w:pPr>
         <w:pStyle w:val="Heading3"/>
       </w:pPr>
-      <w:bookmarkStart w:id="32" w:name="Xbe6755dace1c4bc2b1a5d76fef0c10edcffd953"/>
-      <w:r>
-        <w:t xml:space="preserve">CIP-A106: Intro to Critical Infrastructure</w:t>
+      <w:bookmarkStart w:id="32" w:name="X24d94c374c06f3ca65a41b179e2c670c382cede"/>
+      <w:r>
+        <w:t xml:space="preserve">CIP-A106: Critical Infrastructure &amp; ICS Security</w:t>
       </w:r>
       <w:bookmarkEnd w:id="32"/>
     </w:p>
@@ -3961,7 +3961,7 @@
         <w:t xml:space="preserve"> </w:t>
       </w:r>
       <w:r>
-        <w:t xml:space="preserve">Intro to Critical Infrastructure</w:t>
+        <w:t xml:space="preserve">Critical Infrastructure &amp; ICS Security</w:t>
       </w:r>
       <w:r>
         <w:t xml:space="preserve"> </w:t>
@@ -4431,9 +4431,9 @@
       <w:pPr>
         <w:pStyle w:val="Heading3"/>
       </w:pPr>
-      <w:bookmarkStart w:id="33" w:name="X12e5c7e9676214965db8a85ef7117f9e2407b6f"/>
-      <w:r>
-        <w:t xml:space="preserve">CIP-A107: Security Operations Fundamentals</w:t>
+      <w:bookmarkStart w:id="33" w:name="X14ee5b3f8d07bbf8814fc67aad8c9b834bfcb30"/>
+      <w:r>
+        <w:t xml:space="preserve">CIP-A107: Security Operations Centre (SOC) Essentials</w:t>
       </w:r>
       <w:bookmarkEnd w:id="33"/>
     </w:p>
@@ -4466,7 +4466,7 @@
         <w:t xml:space="preserve"> </w:t>
       </w:r>
       <w:r>
-        <w:t xml:space="preserve">Security Operations Fundamentals</w:t>
+        <w:t xml:space="preserve">Security Operations Centre (SOC) Essentials</w:t>
       </w:r>
       <w:r>
         <w:t xml:space="preserve"> </w:t>
@@ -4775,9 +4775,9 @@
       <w:pPr>
         <w:pStyle w:val="Heading3"/>
       </w:pPr>
-      <w:bookmarkStart w:id="34" w:name="cip-a108-ndg-security-v4"/>
-      <w:r>
-        <w:t xml:space="preserve">CIP-A108: NDG Security+ v4</w:t>
+      <w:bookmarkStart w:id="34" w:name="cip-a108-applied-security-engineering"/>
+      <w:r>
+        <w:t xml:space="preserve">CIP-A108: Applied Security Engineering</w:t>
       </w:r>
       <w:bookmarkEnd w:id="34"/>
     </w:p>
@@ -4810,7 +4810,7 @@
         <w:t xml:space="preserve"> </w:t>
       </w:r>
       <w:r>
-        <w:t xml:space="preserve">NDG Security+ v4</w:t>
+        <w:t xml:space="preserve">Applied Security Engineering</w:t>
       </w:r>
       <w:r>
         <w:t xml:space="preserve"> </w:t>
@@ -5562,9 +5562,9 @@
       <w:pPr>
         <w:pStyle w:val="Heading3"/>
       </w:pPr>
-      <w:bookmarkStart w:id="35" w:name="cip-a109-cloud-security-fundamentals"/>
-      <w:r>
-        <w:t xml:space="preserve">CIP-A109: Cloud Security Fundamentals</w:t>
+      <w:bookmarkStart w:id="35" w:name="cip-a109-cloud-security-architecture"/>
+      <w:r>
+        <w:t xml:space="preserve">CIP-A109: Cloud Security Architecture</w:t>
       </w:r>
       <w:bookmarkEnd w:id="35"/>
     </w:p>
@@ -5597,7 +5597,7 @@
         <w:t xml:space="preserve"> </w:t>
       </w:r>
       <w:r>
-        <w:t xml:space="preserve">Cloud Security Fundamentals</w:t>
+        <w:t xml:space="preserve">Cloud Security Architecture</w:t>
       </w:r>
       <w:r>
         <w:t xml:space="preserve"> </w:t>
@@ -5930,9 +5930,9 @@
       <w:pPr>
         <w:pStyle w:val="Heading3"/>
       </w:pPr>
-      <w:bookmarkStart w:id="36" w:name="cip-a110-cloud-security-automation"/>
-      <w:r>
-        <w:t xml:space="preserve">CIP-A110: Cloud Security Automation</w:t>
+      <w:bookmarkStart w:id="36" w:name="X709380a58b3c587fb618b6a756804ab8992d414"/>
+      <w:r>
+        <w:t xml:space="preserve">CIP-A110: Cloud Security Automation &amp; DevSecOps</w:t>
       </w:r>
       <w:bookmarkEnd w:id="36"/>
     </w:p>
@@ -5965,7 +5965,7 @@
         <w:t xml:space="preserve"> </w:t>
       </w:r>
       <w:r>
-        <w:t xml:space="preserve">Cloud Security Automation</w:t>
+        <w:t xml:space="preserve">Cloud Security Automation &amp; DevSecOps</w:t>
       </w:r>
       <w:r>
         <w:t xml:space="preserve"> </w:t>
@@ -6349,9 +6349,9 @@
       <w:pPr>
         <w:pStyle w:val="Heading3"/>
       </w:pPr>
-      <w:bookmarkStart w:id="38" w:name="cip-b101-introduction-to-linux-1"/>
-      <w:r>
-        <w:t xml:space="preserve">CIP-B101: Introduction to Linux 1</w:t>
+      <w:bookmarkStart w:id="38" w:name="cip-b101-linux-systems-fundamentals-i"/>
+      <w:r>
+        <w:t xml:space="preserve">CIP-B101: Linux Systems Fundamentals I</w:t>
       </w:r>
       <w:bookmarkEnd w:id="38"/>
     </w:p>
@@ -6384,7 +6384,7 @@
         <w:t xml:space="preserve"> </w:t>
       </w:r>
       <w:r>
-        <w:t xml:space="preserve">Introduction to Linux 1</w:t>
+        <w:t xml:space="preserve">Linux Systems Fundamentals I</w:t>
       </w:r>
       <w:r>
         <w:t xml:space="preserve"> </w:t>
@@ -7292,9 +7292,9 @@
       <w:pPr>
         <w:pStyle w:val="Heading3"/>
       </w:pPr>
-      <w:bookmarkStart w:id="39" w:name="cip-b102-introduction-to-linux-2"/>
-      <w:r>
-        <w:t xml:space="preserve">CIP-B102: Introduction to Linux 2</w:t>
+      <w:bookmarkStart w:id="39" w:name="cip-b102-linux-systems-fundamentals-ii"/>
+      <w:r>
+        <w:t xml:space="preserve">CIP-B102: Linux Systems Fundamentals II</w:t>
       </w:r>
       <w:bookmarkEnd w:id="39"/>
     </w:p>
@@ -7327,7 +7327,7 @@
         <w:t xml:space="preserve"> </w:t>
       </w:r>
       <w:r>
-        <w:t xml:space="preserve">Introduction to Linux 2</w:t>
+        <w:t xml:space="preserve">Linux Systems Fundamentals II</w:t>
       </w:r>
       <w:r>
         <w:t xml:space="preserve"> </w:t>
@@ -8099,9 +8099,9 @@
       <w:pPr>
         <w:pStyle w:val="Heading3"/>
       </w:pPr>
-      <w:bookmarkStart w:id="40" w:name="cip-b103-network-security-fundamentals"/>
-      <w:r>
-        <w:t xml:space="preserve">CIP-B103: Network Security Fundamentals</w:t>
+      <w:bookmarkStart w:id="40" w:name="X3529c30b1fff54301f8b074531a85d07864fca2"/>
+      <w:r>
+        <w:t xml:space="preserve">CIP-B103: Network Defence &amp; Traffic Analysis</w:t>
       </w:r>
       <w:bookmarkEnd w:id="40"/>
     </w:p>
@@ -8134,7 +8134,7 @@
         <w:t xml:space="preserve"> </w:t>
       </w:r>
       <w:r>
-        <w:t xml:space="preserve">Network Security Fundamentals</w:t>
+        <w:t xml:space="preserve">Network Defence &amp; Traffic Analysis</w:t>
       </w:r>
       <w:r>
         <w:t xml:space="preserve"> </w:t>
@@ -8443,9 +8443,9 @@
       <w:pPr>
         <w:pStyle w:val="Heading3"/>
       </w:pPr>
-      <w:bookmarkStart w:id="41" w:name="cip-b104-ndg-security-v4"/>
-      <w:r>
-        <w:t xml:space="preserve">CIP-B104: NDG Security+ v4</w:t>
+      <w:bookmarkStart w:id="41" w:name="cip-b104-applied-security-engineering"/>
+      <w:r>
+        <w:t xml:space="preserve">CIP-B104: Applied Security Engineering</w:t>
       </w:r>
       <w:bookmarkEnd w:id="41"/>
     </w:p>
@@ -8478,7 +8478,7 @@
         <w:t xml:space="preserve"> </w:t>
       </w:r>
       <w:r>
-        <w:t xml:space="preserve">NDG Security+ v4</w:t>
+        <w:t xml:space="preserve">Applied Security Engineering</w:t>
       </w:r>
       <w:r>
         <w:t xml:space="preserve"> </w:t>
@@ -9230,9 +9230,9 @@
       <w:pPr>
         <w:pStyle w:val="Heading3"/>
       </w:pPr>
-      <w:bookmarkStart w:id="42" w:name="cip-b105-ndg-forensics-v2"/>
-      <w:r>
-        <w:t xml:space="preserve">CIP-B105: NDG Forensics v2</w:t>
+      <w:bookmarkStart w:id="42" w:name="Xdfe4bbfc922d2d7e0901b97b2df46e35415be61"/>
+      <w:r>
+        <w:t xml:space="preserve">CIP-B105: Digital Forensics &amp; Evidence Analysis</w:t>
       </w:r>
       <w:bookmarkEnd w:id="42"/>
     </w:p>
@@ -9265,7 +9265,7 @@
         <w:t xml:space="preserve"> </w:t>
       </w:r>
       <w:r>
-        <w:t xml:space="preserve">NDG Forensics v2</w:t>
+        <w:t xml:space="preserve">Digital Forensics &amp; Evidence Analysis</w:t>
       </w:r>
       <w:r>
         <w:t xml:space="preserve"> </w:t>
@@ -9310,7 +9310,7 @@
         <w:t xml:space="preserve"> </w:t>
       </w:r>
       <w:r>
-        <w:t xml:space="preserve">Prepare for a variety of IT positions, including Computer Forensic Analyst, Digital Forensic Examiner, Digital Forensics Incident Response, and Security Administrator.</w:t>
+        <w:t xml:space="preserve">Develop the core digital forensics skills required for roles such as Computer Forensic Analyst, Digital Forensic Examiner, Digital Forensics Incident Response Specialist, and Security Administrator.</w:t>
       </w:r>
     </w:p>
     <w:p>
@@ -9903,9 +9903,9 @@
       <w:pPr>
         <w:pStyle w:val="Heading3"/>
       </w:pPr>
-      <w:bookmarkStart w:id="43" w:name="X19f293a5a644577c8a2e3ce56838687f518d071"/>
-      <w:r>
-        <w:t xml:space="preserve">CIP-B106: Security Operations Fundamentals</w:t>
+      <w:bookmarkStart w:id="43" w:name="X69a80a5e249c4e4279416c9079e2f2f01dc8d86"/>
+      <w:r>
+        <w:t xml:space="preserve">CIP-B106: Security Operations Centre (SOC) Essentials</w:t>
       </w:r>
       <w:bookmarkEnd w:id="43"/>
     </w:p>
@@ -9938,7 +9938,7 @@
         <w:t xml:space="preserve"> </w:t>
       </w:r>
       <w:r>
-        <w:t xml:space="preserve">Security Operations Fundamentals</w:t>
+        <w:t xml:space="preserve">Security Operations Centre (SOC) Essentials</w:t>
       </w:r>
       <w:r>
         <w:t xml:space="preserve"> </w:t>
@@ -10247,9 +10247,9 @@
       <w:pPr>
         <w:pStyle w:val="Heading3"/>
       </w:pPr>
-      <w:bookmarkStart w:id="44" w:name="cip-b107-forensics-case-studies"/>
-      <w:r>
-        <w:t xml:space="preserve">CIP-B107: Forensics Case Studies</w:t>
+      <w:bookmarkStart w:id="44" w:name="Xd721ca47522dfe15d5e687d86634a618d5041da"/>
+      <w:r>
+        <w:t xml:space="preserve">CIP-B107: Advanced Forensic Investigations</w:t>
       </w:r>
       <w:bookmarkEnd w:id="44"/>
     </w:p>
@@ -10282,7 +10282,7 @@
         <w:t xml:space="preserve"> </w:t>
       </w:r>
       <w:r>
-        <w:t xml:space="preserve">Forensics Case Studies</w:t>
+        <w:t xml:space="preserve">Advanced Forensic Investigations</w:t>
       </w:r>
       <w:r>
         <w:t xml:space="preserve"> </w:t>
@@ -10714,7 +10714,7 @@
               <w:jc w:val="left"/>
             </w:pPr>
             <w:r>
-              <w:t xml:space="preserve">Introduction to Linux 1</w:t>
+              <w:t xml:space="preserve">Linux Systems Fundamentals I</w:t>
             </w:r>
           </w:p>
         </w:tc>
@@ -10760,7 +10760,7 @@
               <w:jc w:val="left"/>
             </w:pPr>
             <w:r>
-              <w:t xml:space="preserve">Introduction to Linux 1</w:t>
+              <w:t xml:space="preserve">Linux Systems Fundamentals I</w:t>
             </w:r>
           </w:p>
         </w:tc>
@@ -10806,7 +10806,7 @@
               <w:jc w:val="left"/>
             </w:pPr>
             <w:r>
-              <w:t xml:space="preserve">Introduction to Linux 1</w:t>
+              <w:t xml:space="preserve">Linux Systems Fundamentals I</w:t>
             </w:r>
           </w:p>
         </w:tc>
@@ -10852,7 +10852,7 @@
               <w:jc w:val="left"/>
             </w:pPr>
             <w:r>
-              <w:t xml:space="preserve">Introduction to Linux 2</w:t>
+              <w:t xml:space="preserve">Linux Systems Fundamentals II</w:t>
             </w:r>
           </w:p>
         </w:tc>
@@ -10898,7 +10898,7 @@
               <w:jc w:val="left"/>
             </w:pPr>
             <w:r>
-              <w:t xml:space="preserve">Introduction to Linux 2</w:t>
+              <w:t xml:space="preserve">Linux Systems Fundamentals II</w:t>
             </w:r>
           </w:p>
         </w:tc>
@@ -10944,7 +10944,7 @@
               <w:jc w:val="left"/>
             </w:pPr>
             <w:r>
-              <w:t xml:space="preserve">Introduction to Linux 2</w:t>
+              <w:t xml:space="preserve">Linux Systems Fundamentals II</w:t>
             </w:r>
           </w:p>
         </w:tc>
@@ -10990,7 +10990,7 @@
               <w:jc w:val="left"/>
             </w:pPr>
             <w:r>
-              <w:t xml:space="preserve">Network Security Fundamentals</w:t>
+              <w:t xml:space="preserve">Network Defence &amp; Traffic Analysis</w:t>
             </w:r>
           </w:p>
         </w:tc>
@@ -11036,7 +11036,7 @@
               <w:jc w:val="left"/>
             </w:pPr>
             <w:r>
-              <w:t xml:space="preserve">Network Security Fundamentals</w:t>
+              <w:t xml:space="preserve">Network Defence &amp; Traffic Analysis</w:t>
             </w:r>
           </w:p>
         </w:tc>
@@ -11082,7 +11082,7 @@
               <w:jc w:val="left"/>
             </w:pPr>
             <w:r>
-              <w:t xml:space="preserve">NDG Ethical Hacking v2 – Series 1</w:t>
+              <w:t xml:space="preserve">Offensive Security Operations I</w:t>
             </w:r>
           </w:p>
         </w:tc>
@@ -11128,7 +11128,7 @@
               <w:jc w:val="left"/>
             </w:pPr>
             <w:r>
-              <w:t xml:space="preserve">NDG Ethical Hacking v2 – Series 1</w:t>
+              <w:t xml:space="preserve">Offensive Security Operations I</w:t>
             </w:r>
           </w:p>
         </w:tc>
@@ -11174,7 +11174,7 @@
               <w:jc w:val="left"/>
             </w:pPr>
             <w:r>
-              <w:t xml:space="preserve">NDG Ethical Hacking v2 – Series 1</w:t>
+              <w:t xml:space="preserve">Offensive Security Operations I</w:t>
             </w:r>
           </w:p>
         </w:tc>
@@ -11220,7 +11220,7 @@
               <w:jc w:val="left"/>
             </w:pPr>
             <w:r>
-              <w:t xml:space="preserve">NDG Ethical Hacking v2 – Series 2</w:t>
+              <w:t xml:space="preserve">Offensive Security Operations II</w:t>
             </w:r>
           </w:p>
         </w:tc>
@@ -11266,7 +11266,7 @@
               <w:jc w:val="left"/>
             </w:pPr>
             <w:r>
-              <w:t xml:space="preserve">NDG Ethical Hacking v2 – Series 2</w:t>
+              <w:t xml:space="preserve">Offensive Security Operations II</w:t>
             </w:r>
           </w:p>
         </w:tc>
@@ -11312,7 +11312,7 @@
               <w:jc w:val="left"/>
             </w:pPr>
             <w:r>
-              <w:t xml:space="preserve">Intro to Critical Infrastructure</w:t>
+              <w:t xml:space="preserve">Critical Infrastructure &amp; ICS Security</w:t>
             </w:r>
           </w:p>
         </w:tc>
@@ -11358,7 +11358,7 @@
               <w:jc w:val="left"/>
             </w:pPr>
             <w:r>
-              <w:t xml:space="preserve">Intro to Critical Infrastructure</w:t>
+              <w:t xml:space="preserve">Critical Infrastructure &amp; ICS Security</w:t>
             </w:r>
           </w:p>
         </w:tc>
@@ -11404,7 +11404,7 @@
               <w:jc w:val="left"/>
             </w:pPr>
             <w:r>
-              <w:t xml:space="preserve">Intro to Critical Infrastructure</w:t>
+              <w:t xml:space="preserve">Critical Infrastructure &amp; ICS Security</w:t>
             </w:r>
           </w:p>
         </w:tc>
@@ -11450,7 +11450,7 @@
               <w:jc w:val="left"/>
             </w:pPr>
             <w:r>
-              <w:t xml:space="preserve">Security Operations Fundamentals</w:t>
+              <w:t xml:space="preserve">Security Operations Centre (SOC) Essentials</w:t>
             </w:r>
           </w:p>
         </w:tc>
@@ -11496,7 +11496,7 @@
               <w:jc w:val="left"/>
             </w:pPr>
             <w:r>
-              <w:t xml:space="preserve">Security Operations Fundamentals</w:t>
+              <w:t xml:space="preserve">Security Operations Centre (SOC) Essentials</w:t>
             </w:r>
           </w:p>
         </w:tc>
@@ -11542,7 +11542,7 @@
               <w:jc w:val="left"/>
             </w:pPr>
             <w:r>
-              <w:t xml:space="preserve">NDG Security+ v4</w:t>
+              <w:t xml:space="preserve">Applied Security Engineering</w:t>
             </w:r>
           </w:p>
         </w:tc>
@@ -11588,7 +11588,7 @@
               <w:jc w:val="left"/>
             </w:pPr>
             <w:r>
-              <w:t xml:space="preserve">NDG Security+ v4</w:t>
+              <w:t xml:space="preserve">Applied Security Engineering</w:t>
             </w:r>
           </w:p>
         </w:tc>
@@ -11634,7 +11634,7 @@
               <w:jc w:val="left"/>
             </w:pPr>
             <w:r>
-              <w:t xml:space="preserve">NDG Security+ v4</w:t>
+              <w:t xml:space="preserve">Applied Security Engineering</w:t>
             </w:r>
           </w:p>
         </w:tc>
@@ -11680,7 +11680,7 @@
               <w:jc w:val="left"/>
             </w:pPr>
             <w:r>
-              <w:t xml:space="preserve">Cloud Security Fundamentals</w:t>
+              <w:t xml:space="preserve">Cloud Security Architecture</w:t>
             </w:r>
           </w:p>
         </w:tc>
@@ -11726,7 +11726,7 @@
               <w:jc w:val="left"/>
             </w:pPr>
             <w:r>
-              <w:t xml:space="preserve">Cloud Security Fundamentals</w:t>
+              <w:t xml:space="preserve">Cloud Security Architecture</w:t>
             </w:r>
           </w:p>
         </w:tc>
@@ -11772,7 +11772,7 @@
               <w:jc w:val="left"/>
             </w:pPr>
             <w:r>
-              <w:t xml:space="preserve">Cloud Security Automation</w:t>
+              <w:t xml:space="preserve">Cloud Security Automation &amp; DevSecOps</w:t>
             </w:r>
           </w:p>
         </w:tc>
@@ -11818,7 +11818,7 @@
               <w:jc w:val="left"/>
             </w:pPr>
             <w:r>
-              <w:t xml:space="preserve">Cloud Security Automation</w:t>
+              <w:t xml:space="preserve">Cloud Security Automation &amp; DevSecOps</w:t>
             </w:r>
           </w:p>
         </w:tc>
@@ -12013,7 +12013,7 @@
               <w:jc w:val="left"/>
             </w:pPr>
             <w:r>
-              <w:t xml:space="preserve">Introduction to Linux 1</w:t>
+              <w:t xml:space="preserve">Linux Systems Fundamentals I</w:t>
             </w:r>
           </w:p>
         </w:tc>
@@ -12059,7 +12059,7 @@
               <w:jc w:val="left"/>
             </w:pPr>
             <w:r>
-              <w:t xml:space="preserve">Introduction to Linux 1</w:t>
+              <w:t xml:space="preserve">Linux Systems Fundamentals I</w:t>
             </w:r>
           </w:p>
         </w:tc>
@@ -12105,7 +12105,7 @@
               <w:jc w:val="left"/>
             </w:pPr>
             <w:r>
-              <w:t xml:space="preserve">Introduction to Linux 1</w:t>
+              <w:t xml:space="preserve">Linux Systems Fundamentals I</w:t>
             </w:r>
           </w:p>
         </w:tc>
@@ -12151,7 +12151,7 @@
               <w:jc w:val="left"/>
             </w:pPr>
             <w:r>
-              <w:t xml:space="preserve">Introduction to Linux 2</w:t>
+              <w:t xml:space="preserve">Linux Systems Fundamentals II</w:t>
             </w:r>
           </w:p>
         </w:tc>
@@ -12197,7 +12197,7 @@
               <w:jc w:val="left"/>
             </w:pPr>
             <w:r>
-              <w:t xml:space="preserve">Introduction to Linux 2</w:t>
+              <w:t xml:space="preserve">Linux Systems Fundamentals II</w:t>
             </w:r>
           </w:p>
         </w:tc>
@@ -12243,7 +12243,7 @@
               <w:jc w:val="left"/>
             </w:pPr>
             <w:r>
-              <w:t xml:space="preserve">Introduction to Linux 2</w:t>
+              <w:t xml:space="preserve">Linux Systems Fundamentals II</w:t>
             </w:r>
           </w:p>
         </w:tc>
@@ -12289,7 +12289,7 @@
               <w:jc w:val="left"/>
             </w:pPr>
             <w:r>
-              <w:t xml:space="preserve">Network Security Fundamentals</w:t>
+              <w:t xml:space="preserve">Network Defence &amp; Traffic Analysis</w:t>
             </w:r>
           </w:p>
         </w:tc>
@@ -12335,7 +12335,7 @@
               <w:jc w:val="left"/>
             </w:pPr>
             <w:r>
-              <w:t xml:space="preserve">Network Security Fundamentals</w:t>
+              <w:t xml:space="preserve">Network Defence &amp; Traffic Analysis</w:t>
             </w:r>
           </w:p>
         </w:tc>
@@ -12381,7 +12381,7 @@
               <w:jc w:val="left"/>
             </w:pPr>
             <w:r>
-              <w:t xml:space="preserve">NDG Security+ v4</w:t>
+              <w:t xml:space="preserve">Applied Security Engineering</w:t>
             </w:r>
           </w:p>
         </w:tc>
@@ -12427,7 +12427,7 @@
               <w:jc w:val="left"/>
             </w:pPr>
             <w:r>
-              <w:t xml:space="preserve">NDG Security+ v4</w:t>
+              <w:t xml:space="preserve">Applied Security Engineering</w:t>
             </w:r>
           </w:p>
         </w:tc>
@@ -12473,7 +12473,7 @@
               <w:jc w:val="left"/>
             </w:pPr>
             <w:r>
-              <w:t xml:space="preserve">NDG Security+ v4</w:t>
+              <w:t xml:space="preserve">Applied Security Engineering</w:t>
             </w:r>
           </w:p>
         </w:tc>
@@ -12519,7 +12519,7 @@
               <w:jc w:val="left"/>
             </w:pPr>
             <w:r>
-              <w:t xml:space="preserve">NDG Security+ v4</w:t>
+              <w:t xml:space="preserve">Applied Security Engineering</w:t>
             </w:r>
           </w:p>
         </w:tc>
@@ -12565,7 +12565,7 @@
               <w:jc w:val="left"/>
             </w:pPr>
             <w:r>
-              <w:t xml:space="preserve">NDG Forensics v2</w:t>
+              <w:t xml:space="preserve">Digital Forensics &amp; Evidence Analysis</w:t>
             </w:r>
           </w:p>
         </w:tc>
@@ -12611,7 +12611,7 @@
               <w:jc w:val="left"/>
             </w:pPr>
             <w:r>
-              <w:t xml:space="preserve">NDG Forensics v2</w:t>
+              <w:t xml:space="preserve">Digital Forensics &amp; Evidence Analysis</w:t>
             </w:r>
           </w:p>
         </w:tc>
@@ -12657,7 +12657,7 @@
               <w:jc w:val="left"/>
             </w:pPr>
             <w:r>
-              <w:t xml:space="preserve">NDG Forensics v2</w:t>
+              <w:t xml:space="preserve">Digital Forensics &amp; Evidence Analysis</w:t>
             </w:r>
           </w:p>
         </w:tc>
@@ -12703,7 +12703,7 @@
               <w:jc w:val="left"/>
             </w:pPr>
             <w:r>
-              <w:t xml:space="preserve">NDG Forensics v2</w:t>
+              <w:t xml:space="preserve">Digital Forensics &amp; Evidence Analysis</w:t>
             </w:r>
           </w:p>
         </w:tc>
@@ -12749,7 +12749,7 @@
               <w:jc w:val="left"/>
             </w:pPr>
             <w:r>
-              <w:t xml:space="preserve">Security Operations Fundamentals</w:t>
+              <w:t xml:space="preserve">Security Operations Centre (SOC) Essentials</w:t>
             </w:r>
           </w:p>
         </w:tc>
@@ -12795,7 +12795,7 @@
               <w:jc w:val="left"/>
             </w:pPr>
             <w:r>
-              <w:t xml:space="preserve">Security Operations Fundamentals</w:t>
+              <w:t xml:space="preserve">Security Operations Centre (SOC) Essentials</w:t>
             </w:r>
           </w:p>
         </w:tc>
@@ -12841,7 +12841,7 @@
               <w:jc w:val="left"/>
             </w:pPr>
             <w:r>
-              <w:t xml:space="preserve">Forensics Case Studies</w:t>
+              <w:t xml:space="preserve">Advanced Forensic Investigations</w:t>
             </w:r>
           </w:p>
         </w:tc>
@@ -12887,7 +12887,7 @@
               <w:jc w:val="left"/>
             </w:pPr>
             <w:r>
-              <w:t xml:space="preserve">Forensics Case Studies</w:t>
+              <w:t xml:space="preserve">Advanced Forensic Investigations</w:t>
             </w:r>
           </w:p>
         </w:tc>
@@ -12933,7 +12933,7 @@
               <w:jc w:val="left"/>
             </w:pPr>
             <w:r>
-              <w:t xml:space="preserve">Forensics Case Studies</w:t>
+              <w:t xml:space="preserve">Advanced Forensic Investigations</w:t>
             </w:r>
           </w:p>
         </w:tc>
@@ -12979,7 +12979,7 @@
               <w:jc w:val="left"/>
             </w:pPr>
             <w:r>
-              <w:t xml:space="preserve">Forensics Case Studies</w:t>
+              <w:t xml:space="preserve">Advanced Forensic Investigations</w:t>
             </w:r>
           </w:p>
         </w:tc>
@@ -13025,7 +13025,7 @@
               <w:jc w:val="left"/>
             </w:pPr>
             <w:r>
-              <w:t xml:space="preserve">Forensics Case Studies</w:t>
+              <w:t xml:space="preserve">Advanced Forensic Investigations</w:t>
             </w:r>
           </w:p>
         </w:tc>
@@ -13071,7 +13071,7 @@
               <w:jc w:val="left"/>
             </w:pPr>
             <w:r>
-              <w:t xml:space="preserve">Forensics Case Studies</w:t>
+              <w:t xml:space="preserve">Advanced Forensic Investigations</w:t>
             </w:r>
           </w:p>
         </w:tc>
@@ -13117,7 +13117,7 @@
               <w:jc w:val="left"/>
             </w:pPr>
             <w:r>
-              <w:t xml:space="preserve">Forensics Case Studies</w:t>
+              <w:t xml:space="preserve">Advanced Forensic Investigations</w:t>
             </w:r>
           </w:p>
         </w:tc>
@@ -13712,7 +13712,7 @@
         <w:pStyle w:val="Compact"/>
       </w:pPr>
       <w:r>
-        <w:t xml:space="preserve">LPI LPIC-1 101 Certification Exam Coupon (Introduction to Linux 1)</w:t>
+        <w:t xml:space="preserve">LPI LPIC-1 101 Certification Exam Coupon (Linux Systems Fundamentals I)</w:t>
       </w:r>
     </w:p>
     <w:p>
@@ -13724,7 +13724,7 @@
         <w:pStyle w:val="Compact"/>
       </w:pPr>
       <w:r>
-        <w:t xml:space="preserve">LPI LPIC-1 102 Certification Exam Coupon (Introduction to Linux 2)</w:t>
+        <w:t xml:space="preserve">LPI LPIC-1 102 Certification Exam Coupon (Linux Systems Fundamentals II)</w:t>
       </w:r>
     </w:p>
     <w:p>

</xml_diff>